<commit_message>
P2: set premium price 19,900 RUB and align buyer/free entry
</commit_message>
<xml_diff>
--- a/products-storage/00-free-dopy-ne-v-podarok/01-checklist-do-nachala-doprabot.docx
+++ b/products-storage/00-free-dopy-ne-v-podarok/01-checklist-do-nachala-doprabot.docx
@@ -4,14 +4,18 @@
   <w:body>
     <w:p>
       <w:pPr>
-        <w:pStyle w:val="Title"/>
         <w:jc w:val="center"/>
       </w:pPr>
       <w:r>
+        <w:rPr>
+          <w:rFonts w:ascii="Arial" w:hAnsi="Arial"/>
+          <w:b/>
+          <w:color w:val="292E33"/>
+          <w:sz w:val="34"/>
+        </w:rPr>
         <w:t>ЧЕК-ЛИСТ: Что проверить ДО начала допработ</w:t>
       </w:r>
     </w:p>
-    <w:p/>
     <w:p>
       <w:pPr>
         <w:pStyle w:val="Heading1"/>
@@ -86,7 +90,7 @@
     </w:p>
     <w:p>
       <w:r>
-        <w:t>Риск неоплаты допработ резко возрастает. Рекомендуем остановиться и зафиксировать условия в письменном виде. Используйте схему фиксации поручения и шаблон уведомления из этого комплекта.</w:t>
+        <w:t>Риск неоплаты допработ резко возрастает. Рекомендуем остановиться и зафиксировать условия в письменном виде. Используйте схему фиксации поручения и форму уведомления из этого комплекта.</w:t>
       </w:r>
     </w:p>
     <w:p>
@@ -94,7 +98,7 @@
         <w:pStyle w:val="Heading1"/>
       </w:pPr>
       <w:r>
-        <w:t>⚠️ Что этот материал НЕ закрывает</w:t>
+        <w:t>Следующий шаг — оформить условия</w:t>
       </w:r>
     </w:p>
     <w:p>
@@ -102,7 +106,7 @@
         <w:pStyle w:val="ListBullet"/>
       </w:pPr>
       <w:r>
-        <w:t>Составление юридически корректного допсоглашения с расчетом стоимости</w:t>
+        <w:t>Зафиксируйте поручение и согласуйте конкретный объём работ.</w:t>
       </w:r>
     </w:p>
     <w:p>
@@ -110,7 +114,7 @@
         <w:pStyle w:val="ListBullet"/>
       </w:pPr>
       <w:r>
-        <w:t>Пересмотр календарного плана с учетом допработ и простоев</w:t>
+        <w:t>Рассчитайте стоимость и отразите влияние на сроки.</w:t>
       </w:r>
     </w:p>
     <w:p>
@@ -118,23 +122,7 @@
         <w:pStyle w:val="ListBullet"/>
       </w:pPr>
       <w:r>
-        <w:t>Работа с претензиями заказчика о качестве допработ</w:t>
-      </w:r>
-    </w:p>
-    <w:p>
-      <w:pPr>
-        <w:pStyle w:val="ListBullet"/>
-      </w:pPr>
-      <w:r>
-        <w:t>Взыскание неоплаченных допработ через суд (особенно при отсутствии письменных документов)</w:t>
-      </w:r>
-    </w:p>
-    <w:p>
-      <w:pPr>
-        <w:pStyle w:val="ListBullet"/>
-      </w:pPr>
-      <w:r>
-        <w:t>Фотофиксация: полный регламент с привязкой к актам скрытых работ</w:t>
+        <w:t>Сохраните переписку, фото и документы передачи результата.</w:t>
       </w:r>
     </w:p>
     <w:p>
@@ -147,22 +135,42 @@
     </w:p>
     <w:p>
       <w:r>
-        <w:t>Комплект «Дополнительные работы: как получить оплату» включает: готовые допсоглашения (объем, сроки, цена), калькулятор стоимости, алгоритм согласования с заказчиком, шаблоны писем о приостановке работ.</w:t>
+        <w:t>Комплект «Дополнительные работы: как получить оплату» включает: формы поручения, согласования объёма, расчёт стоимости, журнал и соглашения о цене и сроке.</w:t>
         <w:br/>
         <w:br/>
-        <w:t>Стоимость: 2 490 ₽</w:t>
+        <w:t>Стоимость: 19 900 ₽</w:t>
         <w:br/>
         <w:t>Страница комплекта: https://marzhavbetone.ru/products/p2-dopolnitelnye-raboty.html</w:t>
       </w:r>
     </w:p>
     <w:sectPr>
+      <w:footerReference w:type="default" r:id="rId9"/>
       <w:pgSz w:w="12240" w:h="15840"/>
-      <w:pgMar w:top="1440" w:right="1800" w:bottom="1440" w:left="1800" w:header="720" w:footer="720" w:gutter="0"/>
+      <w:pgMar w:top="1020" w:right="1134" w:bottom="1020" w:left="1134" w:header="720" w:footer="720" w:gutter="0"/>
       <w:cols w:space="720"/>
       <w:docGrid w:linePitch="360"/>
     </w:sectPr>
   </w:body>
 </w:document>
+</file>
+
+<file path=word/footer1.xml><?xml version="1.0" encoding="utf-8"?>
+<w:ftr xmlns:m="http://schemas.openxmlformats.org/officeDocument/2006/math" xmlns:mc="http://schemas.openxmlformats.org/markup-compatibility/2006" xmlns:mo="http://schemas.microsoft.com/office/mac/office/2008/main" xmlns:mv="urn:schemas-microsoft-com:mac:vml" xmlns:o="urn:schemas-microsoft-com:office:office" xmlns:r="http://schemas.openxmlformats.org/officeDocument/2006/relationships" xmlns:v="urn:schemas-microsoft-com:vml" xmlns:w10="urn:schemas-microsoft-com:office:word" xmlns:w14="http://schemas.microsoft.com/office/word/2010/wordml" xmlns:w="http://schemas.openxmlformats.org/wordprocessingml/2006/main" xmlns:wne="http://schemas.microsoft.com/office/word/2006/wordml" xmlns:wp14="http://schemas.microsoft.com/office/word/2010/wordprocessingDrawing" xmlns:wp="http://schemas.openxmlformats.org/drawingml/2006/wordprocessingDrawing" xmlns:wpc="http://schemas.microsoft.com/office/word/2010/wordprocessingCanvas" xmlns:wpg="http://schemas.microsoft.com/office/word/2010/wordprocessingGroup" xmlns:wpi="http://schemas.microsoft.com/office/word/2010/wordprocessingInk" xmlns:wps="http://schemas.microsoft.com/office/word/2010/wordprocessingShape" mc:Ignorable="w14 wp14">
+  <w:p>
+    <w:pPr>
+      <w:pStyle w:val="Footer"/>
+      <w:jc w:val="right"/>
+    </w:pPr>
+    <w:r>
+      <w:rPr>
+        <w:rFonts w:ascii="Arial" w:hAnsi="Arial"/>
+        <w:color w:val="806F4E"/>
+        <w:sz w:val="16"/>
+      </w:rPr>
+      <w:t>МАРЖА В БЕТОНЕ  •  marzhavbetone.ru</w:t>
+    </w:r>
+  </w:p>
+</w:ftr>
 </file>
 
 <file path=word/numbering.xml><?xml version="1.0" encoding="utf-8"?>
@@ -528,6 +536,14 @@
     <w:name w:val="Normal"/>
     <w:qFormat/>
     <w:rsid w:val="00FC693F"/>
+    <w:pPr>
+      <w:spacing w:after="120"/>
+    </w:pPr>
+    <w:rPr>
+      <w:rFonts w:ascii="Arial" w:hAnsi="Arial"/>
+      <w:color w:val="363C41"/>
+      <w:sz w:val="20"/>
+    </w:rPr>
   </w:style>
   <w:style w:type="paragraph" w:styleId="Header">
     <w:name w:val="header"/>
@@ -584,15 +600,15 @@
     <w:pPr>
       <w:keepNext/>
       <w:keepLines/>
-      <w:spacing w:before="480" w:after="0"/>
+      <w:spacing w:before="220" w:after="100"/>
       <w:outlineLvl w:val="0"/>
     </w:pPr>
     <w:rPr>
-      <w:rFonts w:asciiTheme="majorHAnsi" w:eastAsiaTheme="majorEastAsia" w:hAnsiTheme="majorHAnsi" w:cstheme="majorBidi"/>
+      <w:rFonts w:asciiTheme="majorHAnsi" w:eastAsiaTheme="majorEastAsia" w:hAnsiTheme="majorHAnsi" w:cstheme="majorBidi" w:ascii="Arial" w:hAnsi="Arial"/>
       <w:b/>
       <w:bCs/>
-      <w:color w:val="365F91" w:themeColor="accent1" w:themeShade="BF"/>
-      <w:sz w:val="28"/>
+      <w:color w:val="292E33"/>
+      <w:sz w:val="22"/>
       <w:szCs w:val="28"/>
     </w:rPr>
   </w:style>
@@ -873,15 +889,16 @@
       <w:pBdr>
         <w:bottom w:val="single" w:sz="8" w:space="4" w:color="4F81BD" w:themeColor="accent1"/>
       </w:pBdr>
-      <w:spacing w:after="300" w:line="240" w:lineRule="auto"/>
+      <w:spacing w:after="100" w:line="240" w:lineRule="auto" w:before="220"/>
       <w:contextualSpacing/>
     </w:pPr>
     <w:rPr>
-      <w:rFonts w:asciiTheme="majorHAnsi" w:eastAsiaTheme="majorEastAsia" w:hAnsiTheme="majorHAnsi" w:cstheme="majorBidi"/>
-      <w:color w:val="17365D" w:themeColor="text2" w:themeShade="BF"/>
+      <w:rFonts w:asciiTheme="majorHAnsi" w:eastAsiaTheme="majorEastAsia" w:hAnsiTheme="majorHAnsi" w:cstheme="majorBidi" w:ascii="Arial" w:hAnsi="Arial"/>
+      <w:b/>
+      <w:color w:val="292E33"/>
       <w:spacing w:val="5"/>
       <w:kern w:val="28"/>
-      <w:sz w:val="52"/>
+      <w:sz w:val="34"/>
       <w:szCs w:val="52"/>
     </w:rPr>
   </w:style>

</xml_diff>